<commit_message>
feat: Finalizar recursos M2, actualizar bibliografia APA7 y estandarizar navegaci¢n global
</commit_message>
<xml_diff>
--- a/LLM-DEPR/LLM-M2_Recursos_Didacticos.docx
+++ b/LLM-DEPR/LLM-M2_Recursos_Didacticos.docx
@@ -82,6 +82,9 @@
         </w:rPr>
       </w:pPr>
       <w:r>
+        <w:rPr>
+          <w:noProof/>
+        </w:rPr>
         <w:drawing>
           <wp:anchor distT="0" distB="0" distL="114300" distR="114300" simplePos="0" relativeHeight="251658240" behindDoc="1" locked="0" layoutInCell="1" allowOverlap="1" wp14:anchorId="6C8320C4" wp14:editId="3C8F1E38">
             <wp:simplePos x="0" y="0"/>
@@ -184,15 +187,12 @@
       </w:r>
       <w:proofErr w:type="spellEnd"/>
     </w:p>
-    <w:p>
-      <w:pPr>
-        <w:rPr>
-          <w:lang w:val="en-US"/>
-        </w:rPr>
-      </w:pPr>
-    </w:p>
+    <w:p/>
     <w:p>
       <w:r>
+        <w:rPr>
+          <w:noProof/>
+        </w:rPr>
         <w:drawing>
           <wp:anchor distT="0" distB="0" distL="114300" distR="114300" simplePos="0" relativeHeight="251659264" behindDoc="1" locked="0" layoutInCell="1" allowOverlap="1" wp14:anchorId="3D71B138" wp14:editId="0E7F1EE4">
             <wp:simplePos x="0" y="0"/>
@@ -293,8 +293,20 @@
         <w:t>LLM_M2_Recurso_an_easy_guide_to_prompt_engineering_for_edu_pdf</w:t>
       </w:r>
     </w:p>
-    <w:p/>
-    <w:p/>
+    <w:p>
+      <w:pPr>
+        <w:rPr>
+          <w:lang w:val="en-US"/>
+        </w:rPr>
+      </w:pPr>
+    </w:p>
+    <w:p>
+      <w:pPr>
+        <w:rPr>
+          <w:lang w:val="en-US"/>
+        </w:rPr>
+      </w:pPr>
+    </w:p>
     <w:p>
       <w:pPr>
         <w:pStyle w:val="NormalWeb"/>
@@ -502,7 +514,413 @@
         </w:r>
       </w:hyperlink>
     </w:p>
+    <w:p>
+      <w:pPr>
+        <w:rPr>
+          <w:lang w:val="en-US"/>
+        </w:rPr>
+      </w:pPr>
+    </w:p>
+    <w:p>
+      <w:pPr>
+        <w:rPr>
+          <w:lang w:val="en-US"/>
+        </w:rPr>
+      </w:pPr>
+      <w:r>
+        <w:rPr>
+          <w:lang w:val="en-US"/>
+        </w:rPr>
+        <w:t xml:space="preserve">Bibliografia de </w:t>
+      </w:r>
+      <w:proofErr w:type="spellStart"/>
+      <w:r>
+        <w:rPr>
+          <w:lang w:val="en-US"/>
+        </w:rPr>
+        <w:t>referencia</w:t>
+      </w:r>
+      <w:proofErr w:type="spellEnd"/>
+    </w:p>
+    <w:p>
+      <w:pPr>
+        <w:rPr>
+          <w:lang w:val="en-US"/>
+        </w:rPr>
+      </w:pPr>
+      <w:r>
+        <w:rPr>
+          <w:lang w:val="en-US"/>
+        </w:rPr>
+        <w:t xml:space="preserve">LLM_M2_Recurso_Articulo_Realizing the possibilities of the large language </w:t>
+      </w:r>
+      <w:proofErr w:type="gramStart"/>
+      <w:r>
+        <w:rPr>
+          <w:lang w:val="en-US"/>
+        </w:rPr>
+        <w:t>models  Strategies</w:t>
+      </w:r>
+      <w:proofErr w:type="gramEnd"/>
+      <w:r>
+        <w:rPr>
+          <w:lang w:val="en-US"/>
+        </w:rPr>
+        <w:t xml:space="preserve"> for prompt engineering in educational inquiries</w:t>
+      </w:r>
+    </w:p>
+    <w:p>
+      <w:pPr>
+        <w:rPr>
+          <w:lang w:val="en-US"/>
+        </w:rPr>
+      </w:pPr>
+      <w:proofErr w:type="spellStart"/>
+      <w:r>
+        <w:rPr>
+          <w:lang w:val="en-US"/>
+        </w:rPr>
+        <w:t>Referencia</w:t>
+      </w:r>
+      <w:proofErr w:type="spellEnd"/>
+      <w:r>
+        <w:rPr>
+          <w:lang w:val="en-US"/>
+        </w:rPr>
+        <w:t xml:space="preserve">: </w:t>
+      </w:r>
+      <w:r>
+        <w:rPr>
+          <w:lang w:val="en-US"/>
+        </w:rPr>
+        <w:t xml:space="preserve">Ana-Paula Correia, Sean Hickey &amp; Fan Xu (2025) Realizing the possibilities of the large language models: Strategies for prompt engineering in educational inquiries, Theory </w:t>
+      </w:r>
+      <w:proofErr w:type="gramStart"/>
+      <w:r>
+        <w:rPr>
+          <w:lang w:val="en-US"/>
+        </w:rPr>
+        <w:t>Into</w:t>
+      </w:r>
+      <w:proofErr w:type="gramEnd"/>
+      <w:r>
+        <w:rPr>
+          <w:lang w:val="en-US"/>
+        </w:rPr>
+        <w:t xml:space="preserve"> Practice, 64:4, 434-447, DOI: 10.1080/00405841.2025.2528545</w:t>
+      </w:r>
+    </w:p>
     <w:p/>
+    <w:p>
+      <w:r>
+        <w:t xml:space="preserve">LLM_M2_Recurso_Articulo_El diseño de </w:t>
+      </w:r>
+      <w:proofErr w:type="spellStart"/>
+      <w:r>
+        <w:t>prompts</w:t>
+      </w:r>
+      <w:proofErr w:type="spellEnd"/>
+      <w:r>
+        <w:t xml:space="preserve"> como competencia emergente (CRETA+R)</w:t>
+      </w:r>
+    </w:p>
+    <w:p>
+      <w:r>
+        <w:t xml:space="preserve">Referencia: </w:t>
+      </w:r>
+      <w:r>
+        <w:t xml:space="preserve">García-Beltrán, E. (2025). No es magia, es </w:t>
+      </w:r>
+      <w:proofErr w:type="spellStart"/>
+      <w:r>
+        <w:t>prompting</w:t>
+      </w:r>
+      <w:proofErr w:type="spellEnd"/>
+      <w:r>
+        <w:t xml:space="preserve">: el diseño de </w:t>
+      </w:r>
+      <w:proofErr w:type="spellStart"/>
+      <w:r>
+        <w:t>prompts</w:t>
+      </w:r>
+      <w:proofErr w:type="spellEnd"/>
+      <w:r>
+        <w:t xml:space="preserve"> como competencia emergente en la formación docente. Un estudio desde el modelo CRETA+R. </w:t>
+      </w:r>
+      <w:proofErr w:type="gramStart"/>
+      <w:r>
+        <w:rPr>
+          <w:i/>
+          <w:iCs/>
+        </w:rPr>
+        <w:t>Pixel</w:t>
+      </w:r>
+      <w:proofErr w:type="gramEnd"/>
+      <w:r>
+        <w:rPr>
+          <w:i/>
+          <w:iCs/>
+        </w:rPr>
+        <w:t>-Bit Revista De Medios Y Educación</w:t>
+      </w:r>
+      <w:r>
+        <w:t xml:space="preserve">, </w:t>
+      </w:r>
+      <w:r>
+        <w:rPr>
+          <w:i/>
+          <w:iCs/>
+        </w:rPr>
+        <w:t>75</w:t>
+      </w:r>
+      <w:r>
+        <w:t>, 1–18. https://doi.org/10.12795/pixelbit.115487</w:t>
+      </w:r>
+    </w:p>
+    <w:p/>
+    <w:p>
+      <w:pPr>
+        <w:rPr>
+          <w:lang w:val="en-US"/>
+        </w:rPr>
+      </w:pPr>
+      <w:r>
+        <w:rPr>
+          <w:lang w:val="en-US"/>
+        </w:rPr>
+        <w:t>LLM_M2_Recurso_Articulo_Prompt engineering as a new 21st century skill</w:t>
+      </w:r>
+    </w:p>
+    <w:p>
+      <w:proofErr w:type="spellStart"/>
+      <w:r>
+        <w:rPr>
+          <w:lang w:val="en-US"/>
+        </w:rPr>
+        <w:t>Referencia</w:t>
+      </w:r>
+      <w:proofErr w:type="spellEnd"/>
+      <w:r>
+        <w:rPr>
+          <w:lang w:val="en-US"/>
+        </w:rPr>
+        <w:t xml:space="preserve">: </w:t>
+      </w:r>
+      <w:proofErr w:type="spellStart"/>
+      <w:r>
+        <w:rPr>
+          <w:lang w:val="en-US"/>
+        </w:rPr>
+        <w:t>Federiakin</w:t>
+      </w:r>
+      <w:proofErr w:type="spellEnd"/>
+      <w:r>
+        <w:rPr>
+          <w:lang w:val="en-US"/>
+        </w:rPr>
+        <w:t>, D., Molerov, D., Zlatkin-</w:t>
+      </w:r>
+      <w:proofErr w:type="spellStart"/>
+      <w:r>
+        <w:rPr>
+          <w:lang w:val="en-US"/>
+        </w:rPr>
+        <w:t>Troitschanskaia</w:t>
+      </w:r>
+      <w:proofErr w:type="spellEnd"/>
+      <w:r>
+        <w:rPr>
+          <w:lang w:val="en-US"/>
+        </w:rPr>
+        <w:t xml:space="preserve">, O., &amp; Maur, A. (2024). Prompt engineering as a new 21st century skill. </w:t>
+      </w:r>
+      <w:proofErr w:type="spellStart"/>
+      <w:r>
+        <w:rPr>
+          <w:i/>
+          <w:iCs/>
+        </w:rPr>
+        <w:t>Frontiers</w:t>
+      </w:r>
+      <w:proofErr w:type="spellEnd"/>
+      <w:r>
+        <w:rPr>
+          <w:i/>
+          <w:iCs/>
+        </w:rPr>
+        <w:t xml:space="preserve"> in </w:t>
+      </w:r>
+      <w:proofErr w:type="spellStart"/>
+      <w:r>
+        <w:rPr>
+          <w:i/>
+          <w:iCs/>
+        </w:rPr>
+        <w:t>Education</w:t>
+      </w:r>
+      <w:proofErr w:type="spellEnd"/>
+      <w:r>
+        <w:t xml:space="preserve">, </w:t>
+      </w:r>
+      <w:r>
+        <w:rPr>
+          <w:i/>
+          <w:iCs/>
+        </w:rPr>
+        <w:t>9</w:t>
+      </w:r>
+      <w:r>
+        <w:t>. https://doi.org/10.3389/feduc.2024.1366434</w:t>
+      </w:r>
+    </w:p>
+    <w:p>
+      <w:pPr>
+        <w:rPr>
+          <w:lang w:val="en-US"/>
+        </w:rPr>
+      </w:pPr>
+    </w:p>
+    <w:p>
+      <w:pPr>
+        <w:rPr>
+          <w:lang w:val="en-US"/>
+        </w:rPr>
+      </w:pPr>
+      <w:r>
+        <w:rPr>
+          <w:lang w:val="en-US"/>
+        </w:rPr>
+        <w:t>LLM_M2_Recurso_Articulo_Prompt Engineering for LLMs Educational Alignment</w:t>
+      </w:r>
+    </w:p>
+    <w:p>
+      <w:pPr>
+        <w:rPr>
+          <w:lang w:val="en-US"/>
+        </w:rPr>
+      </w:pPr>
+      <w:proofErr w:type="spellStart"/>
+      <w:r>
+        <w:rPr>
+          <w:lang w:val="en-US"/>
+        </w:rPr>
+        <w:lastRenderedPageBreak/>
+        <w:t>Referencia</w:t>
+      </w:r>
+      <w:proofErr w:type="spellEnd"/>
+      <w:r>
+        <w:rPr>
+          <w:lang w:val="en-US"/>
+        </w:rPr>
+        <w:t xml:space="preserve">: </w:t>
+      </w:r>
+      <w:r>
+        <w:rPr>
+          <w:lang w:val="en-US"/>
+        </w:rPr>
+        <w:t xml:space="preserve">Barbero, G., Preuss, M., &amp; Leiden University. (2025). Prompt engineering for LLMs educational alignment. In </w:t>
+      </w:r>
+      <w:r>
+        <w:rPr>
+          <w:i/>
+          <w:iCs/>
+          <w:lang w:val="en-US"/>
+        </w:rPr>
+        <w:t>CEUR Workshop Proceedings</w:t>
+      </w:r>
+      <w:r>
+        <w:rPr>
+          <w:lang w:val="en-US"/>
+        </w:rPr>
+        <w:t xml:space="preserve"> (pp. 1–18) [Journal-article]. CEUR. https://ceur-ws.org/Vol-4138/paper1.pdf</w:t>
+      </w:r>
+    </w:p>
+    <w:p>
+      <w:pPr>
+        <w:rPr>
+          <w:lang w:val="en-US"/>
+        </w:rPr>
+      </w:pPr>
+    </w:p>
+    <w:p>
+      <w:pPr>
+        <w:rPr>
+          <w:lang w:val="en-US"/>
+        </w:rPr>
+      </w:pPr>
+      <w:r>
+        <w:rPr>
+          <w:lang w:val="en-US"/>
+        </w:rPr>
+        <w:t>LLM_M2_Recurso_Articulo_A Systematic Review on Prompt Engineering in Large Language Models for K-12 STEM Education</w:t>
+      </w:r>
+    </w:p>
+    <w:p>
+      <w:pPr>
+        <w:rPr>
+          <w:lang w:val="en-US"/>
+        </w:rPr>
+      </w:pPr>
+      <w:proofErr w:type="spellStart"/>
+      <w:r>
+        <w:rPr>
+          <w:lang w:val="en-US"/>
+        </w:rPr>
+        <w:t>Referencia</w:t>
+      </w:r>
+      <w:proofErr w:type="spellEnd"/>
+      <w:r>
+        <w:rPr>
+          <w:lang w:val="en-US"/>
+        </w:rPr>
+        <w:t xml:space="preserve">: </w:t>
+      </w:r>
+      <w:r>
+        <w:rPr>
+          <w:lang w:val="en-US"/>
+        </w:rPr>
+        <w:t xml:space="preserve">Chen, E., Wang, D., Xu, L., Cao, C., Fang, X., &amp; Lin, J. (2024, October 14). </w:t>
+      </w:r>
+      <w:r>
+        <w:rPr>
+          <w:i/>
+          <w:iCs/>
+          <w:lang w:val="en-US"/>
+        </w:rPr>
+        <w:t xml:space="preserve">A Systematic Review </w:t>
+      </w:r>
+      <w:proofErr w:type="gramStart"/>
+      <w:r>
+        <w:rPr>
+          <w:i/>
+          <w:iCs/>
+          <w:lang w:val="en-US"/>
+        </w:rPr>
+        <w:t>on</w:t>
+      </w:r>
+      <w:proofErr w:type="gramEnd"/>
+      <w:r>
+        <w:rPr>
+          <w:i/>
+          <w:iCs/>
+          <w:lang w:val="en-US"/>
+        </w:rPr>
+        <w:t xml:space="preserve"> Prompt Engineering in Large Language Models for K-12 STEM Education</w:t>
+      </w:r>
+      <w:r>
+        <w:rPr>
+          <w:lang w:val="en-US"/>
+        </w:rPr>
+        <w:t>. arXiv.org. https://arxiv.org/abs/2410.11123</w:t>
+      </w:r>
+    </w:p>
+    <w:p>
+      <w:pPr>
+        <w:rPr>
+          <w:lang w:val="en-US"/>
+        </w:rPr>
+      </w:pPr>
+    </w:p>
     <w:sectPr>
       <w:pgSz w:w="12240" w:h="15840"/>
       <w:pgMar w:top="1440" w:right="1440" w:bottom="1440" w:left="1440" w:header="720" w:footer="720" w:gutter="0"/>

</xml_diff>